<commit_message>
Update Cléanne ATS CV: 51 rue de Tournai, Rose & Black palette, key metrics & training experience
Co-authored-by: arena-agent <297053741+arena-agent@users.noreply.github.com>
</commit_message>
<xml_diff>
--- a/candidatures/cleanne/CV_Cleanne_MINANG_ATS_2026.docx
+++ b/candidatures/cleanne/CV_Cleanne_MINANG_ATS_2026.docx
@@ -4,7 +4,7 @@
   <w:body>
     <w:p>
       <w:pPr>
-        <w:spacing w:before="0" w:after="10" w:line="250" w:lineRule="auto"/>
+        <w:spacing w:before="0" w:after="10" w:line="247" w:lineRule="auto"/>
         <w:jc w:val="center"/>
       </w:pPr>
       <w:r>
@@ -12,7 +12,7 @@
           <w:rFonts w:ascii="Calibri" w:hAnsi="Calibri"/>
           <w:b/>
           <w:i w:val="0"/>
-          <w:color w:val="17375E"/>
+          <w:color w:val="B8336A"/>
           <w:sz w:val="35"/>
         </w:rPr>
         <w:t>CLÉANNE MINANG</w:t>
@@ -20,7 +20,7 @@
     </w:p>
     <w:p>
       <w:pPr>
-        <w:spacing w:before="0" w:after="10" w:line="250" w:lineRule="auto"/>
+        <w:spacing w:before="0" w:after="10" w:line="247" w:lineRule="auto"/>
         <w:jc w:val="center"/>
       </w:pPr>
       <w:r>
@@ -36,7 +36,7 @@
     </w:p>
     <w:p>
       <w:pPr>
-        <w:spacing w:before="0" w:after="30" w:line="250" w:lineRule="auto"/>
+        <w:spacing w:before="0" w:after="24" w:line="247" w:lineRule="auto"/>
         <w:jc w:val="center"/>
       </w:pPr>
       <w:r>
@@ -44,7 +44,7 @@
           <w:rFonts w:ascii="Calibri" w:hAnsi="Calibri"/>
           <w:b/>
           <w:i w:val="0"/>
-          <w:color w:val="17375E"/>
+          <w:color w:val="B8336A"/>
           <w:sz w:val="17"/>
         </w:rPr>
         <w:t>Job Étudiant / CDI Temps Partiel (8h à 25h/sem.) — Disponibilité immédiate (dès 6h, soir, week-end &amp; vacances)</w:t>
@@ -52,7 +52,7 @@
     </w:p>
     <w:p>
       <w:pPr>
-        <w:spacing w:before="0" w:after="60" w:line="250" w:lineRule="auto"/>
+        <w:spacing w:before="0" w:after="50" w:line="247" w:lineRule="auto"/>
         <w:jc w:val="center"/>
       </w:pPr>
       <w:r>
@@ -61,31 +61,125 @@
           <w:b w:val="0"/>
           <w:i w:val="0"/>
           <w:color w:val="111111"/>
-          <w:sz w:val="17"/>
+          <w:sz w:val="16"/>
         </w:rPr>
-        <w:t>+33 7 45 42 93 53  |  minangcalvin0@gmail.com  |  47 rue Vantroyen, 59800 Lille (7 min à pied Lille Flandres / Euralille)</w:t>
+        <w:t>+33 7 45 42 93 53  |  minangcalvin0@gmail.com  |  51 rue de Tournai, 59800 Lille (2 min à pied Gare Lille Flandres / Euralille)</w:t>
       </w:r>
     </w:p>
     <w:p>
       <w:pPr>
-        <w:spacing w:before="90" w:after="40"/>
+        <w:spacing w:before="20" w:after="60"/>
+        <w:jc w:val="center"/>
+        <w:shd w:val="clear" w:color="auto" w:fill="FDF2F6"/>
         <w:pBdr>
-          <w:bottom w:val="single" w:sz="6" w:space="2" w:color="17375E"/>
+          <w:top w:val="single" w:sz="4" w:space="3" w:color="E4AAC2"/>
+          <w:left w:val="single" w:sz="4" w:space="3" w:color="E4AAC2"/>
+          <w:bottom w:val="single" w:sz="4" w:space="3" w:color="E4AAC2"/>
+          <w:right w:val="single" w:sz="4" w:space="3" w:color="E4AAC2"/>
         </w:pBdr>
       </w:pPr>
       <w:r>
         <w:rPr>
           <w:rFonts w:ascii="Calibri" w:hAnsi="Calibri"/>
           <w:b/>
-          <w:color w:val="17375E"/>
-          <w:sz w:val="20"/>
+          <w:color w:val="B8336A"/>
+          <w:sz w:val="16"/>
+        </w:rPr>
+        <w:t xml:space="preserve">CHIFFRES CLÉS :  </w:t>
+      </w:r>
+      <w:r>
+        <w:rPr>
+          <w:rFonts w:ascii="Calibri" w:hAnsi="Calibri"/>
+          <w:b/>
+          <w:color w:val="B8336A"/>
+          <w:sz w:val="16"/>
+        </w:rPr>
+        <w:t>3+ mois</w:t>
+      </w:r>
+      <w:r>
+        <w:rPr>
+          <w:rFonts w:ascii="Calibri" w:hAnsi="Calibri"/>
+          <w:b w:val="0"/>
+          <w:color w:val="111111"/>
+          <w:sz w:val="16"/>
+        </w:rPr>
+        <w:t xml:space="preserve"> d'accueil &amp; relation client  •  </w:t>
+      </w:r>
+      <w:r>
+        <w:rPr>
+          <w:rFonts w:ascii="Calibri" w:hAnsi="Calibri"/>
+          <w:b/>
+          <w:color w:val="B8336A"/>
+          <w:sz w:val="16"/>
+        </w:rPr>
+        <w:t>2 ans</w:t>
+      </w:r>
+      <w:r>
+        <w:rPr>
+          <w:rFonts w:ascii="Calibri" w:hAnsi="Calibri"/>
+          <w:b w:val="0"/>
+          <w:color w:val="111111"/>
+          <w:sz w:val="16"/>
+        </w:rPr>
+        <w:t xml:space="preserve"> d'asso audiovisuelle  •  </w:t>
+      </w:r>
+      <w:r>
+        <w:rPr>
+          <w:rFonts w:ascii="Calibri" w:hAnsi="Calibri"/>
+          <w:b/>
+          <w:color w:val="B8336A"/>
+          <w:sz w:val="16"/>
+        </w:rPr>
+        <w:t>Formation</w:t>
+      </w:r>
+      <w:r>
+        <w:rPr>
+          <w:rFonts w:ascii="Calibri" w:hAnsi="Calibri"/>
+          <w:b w:val="0"/>
+          <w:color w:val="111111"/>
+          <w:sz w:val="16"/>
+        </w:rPr>
+        <w:t xml:space="preserve"> de personnes  •  </w:t>
+      </w:r>
+      <w:r>
+        <w:rPr>
+          <w:rFonts w:ascii="Calibri" w:hAnsi="Calibri"/>
+          <w:b/>
+          <w:color w:val="B8336A"/>
+          <w:sz w:val="16"/>
+        </w:rPr>
+        <w:t>2 min à pied</w:t>
+      </w:r>
+      <w:r>
+        <w:rPr>
+          <w:rFonts w:ascii="Calibri" w:hAnsi="Calibri"/>
+          <w:b w:val="0"/>
+          <w:color w:val="111111"/>
+          <w:sz w:val="16"/>
+        </w:rPr>
+        <w:t xml:space="preserve"> de Lille Flandres</w:t>
+      </w:r>
+    </w:p>
+    <w:p>
+      <w:pPr>
+        <w:spacing w:before="80" w:after="36"/>
+        <w:pBdr>
+          <w:bottom w:val="single" w:sz="6" w:space="2" w:color="B8336A"/>
+        </w:pBdr>
+      </w:pPr>
+      <w:r>
+        <w:rPr>
+          <w:rFonts w:ascii="Calibri" w:hAnsi="Calibri"/>
+          <w:b/>
+          <w:color w:val="B8336A"/>
+          <w:sz w:val="19"/>
         </w:rPr>
         <w:t>PROFIL PROFESSIONNEL</w:t>
       </w:r>
     </w:p>
     <w:p>
       <w:pPr>
-        <w:spacing w:before="0" w:after="30" w:line="250" w:lineRule="auto"/>
+        <w:spacing w:before="0" w:after="24" w:line="247" w:lineRule="auto"/>
         <w:jc w:val="both"/>
       </w:pPr>
       <w:r>
@@ -96,7 +190,7 @@
           <w:color w:val="111111"/>
           <w:sz w:val="17"/>
         </w:rPr>
-        <w:t xml:space="preserve">Étudiante sérieuse, ponctuelle et dynamique en Licence Économie et Gestion à l'Université de Lille (issue de classe préparatoire ECG), résidant à proximité immédiate à pied des gares </w:t>
+        <w:t xml:space="preserve">Étudiante sérieuse, ponctuelle et dynamique en Licence Économie et Gestion à l'Université de Lille (issue de classe préparatoire ECG), résidant au </w:t>
       </w:r>
       <w:r>
         <w:rPr>
@@ -106,7 +200,7 @@
           <w:color w:val="111111"/>
           <w:sz w:val="17"/>
         </w:rPr>
-        <w:t>Lille Flandres / Lille Europe et de Westfield Euralille</w:t>
+        <w:t>51 rue de Tournai à 2 min à pied de la Gare Lille Flandres et de Westfield Euralille</w:t>
       </w:r>
       <w:r>
         <w:rPr>
@@ -116,7 +210,7 @@
           <w:color w:val="111111"/>
           <w:sz w:val="17"/>
         </w:rPr>
-        <w:t xml:space="preserve">. Forte d'expériences concrètes en </w:t>
+        <w:t xml:space="preserve">. Forte de </w:t>
       </w:r>
       <w:r>
         <w:rPr>
@@ -126,7 +220,7 @@
           <w:color w:val="111111"/>
           <w:sz w:val="17"/>
         </w:rPr>
-        <w:t>accueil client à forte affluence</w:t>
+        <w:t>plus de 3 mois d'expérience cumulée au contact direct des clients et visiteurs</w:t>
       </w:r>
       <w:r>
         <w:rPr>
@@ -136,7 +230,7 @@
           <w:color w:val="111111"/>
           <w:sz w:val="17"/>
         </w:rPr>
-        <w:t xml:space="preserve"> (Stade Bollaert-Delelis), en </w:t>
+        <w:t xml:space="preserve"> (accueil événementiel grand flux au Stade Bollaert-Delelis, assistanat d'accueil chez ABC Consulting) et de </w:t>
       </w:r>
       <w:r>
         <w:rPr>
@@ -146,7 +240,7 @@
           <w:color w:val="111111"/>
           <w:sz w:val="17"/>
         </w:rPr>
-        <w:t>coordination opérationnelle d'événements</w:t>
+        <w:t>2 ans de gestion de projets et formation d'équipes</w:t>
       </w:r>
       <w:r>
         <w:rPr>
@@ -156,27 +250,7 @@
           <w:color w:val="111111"/>
           <w:sz w:val="17"/>
         </w:rPr>
-        <w:t xml:space="preserve"> et en </w:t>
-      </w:r>
-      <w:r>
-        <w:rPr>
-          <w:rFonts w:ascii="Calibri" w:hAnsi="Calibri"/>
-          <w:b/>
-          <w:i w:val="0"/>
-          <w:color w:val="111111"/>
-          <w:sz w:val="17"/>
-        </w:rPr>
-        <w:t>appui administratif</w:t>
-      </w:r>
-      <w:r>
-        <w:rPr>
-          <w:rFonts w:ascii="Calibri" w:hAnsi="Calibri"/>
-          <w:b w:val="0"/>
-          <w:i w:val="0"/>
-          <w:color w:val="111111"/>
-          <w:sz w:val="17"/>
-        </w:rPr>
-        <w:t xml:space="preserve">, j'allie sens du service client, esprit d'équipe sous cadence soutenue et aisance avec les chiffres. Opérationnelle immédiatement comme </w:t>
+        <w:t xml:space="preserve"> en association, j'allie sens du service client, rapidité d'exécution et aisance chiffrée. Opérationnelle immédiatement comme </w:t>
       </w:r>
       <w:r>
         <w:rPr>
@@ -196,29 +270,29 @@
           <w:color w:val="111111"/>
           <w:sz w:val="17"/>
         </w:rPr>
-        <w:t xml:space="preserve"> en CDI étudiant ou temps partiel.</w:t>
+        <w:t>.</w:t>
       </w:r>
     </w:p>
     <w:p>
       <w:pPr>
-        <w:spacing w:before="90" w:after="40"/>
+        <w:spacing w:before="80" w:after="36"/>
         <w:pBdr>
-          <w:bottom w:val="single" w:sz="6" w:space="2" w:color="17375E"/>
+          <w:bottom w:val="single" w:sz="6" w:space="2" w:color="B8336A"/>
         </w:pBdr>
       </w:pPr>
       <w:r>
         <w:rPr>
           <w:rFonts w:ascii="Calibri" w:hAnsi="Calibri"/>
           <w:b/>
-          <w:color w:val="17375E"/>
-          <w:sz w:val="20"/>
+          <w:color w:val="B8336A"/>
+          <w:sz w:val="19"/>
         </w:rPr>
         <w:t>EXPÉRIENCE PROFESSIONNELLE</w:t>
       </w:r>
     </w:p>
     <w:p>
       <w:pPr>
-        <w:spacing w:before="40" w:after="6" w:line="250" w:lineRule="auto"/>
+        <w:spacing w:before="36" w:after="4" w:line="247" w:lineRule="auto"/>
         <w:jc w:val="left"/>
       </w:pPr>
       <w:r>
@@ -234,7 +308,7 @@
     </w:p>
     <w:p>
       <w:pPr>
-        <w:spacing w:before="0" w:after="20" w:line="250" w:lineRule="auto"/>
+        <w:spacing w:before="0" w:after="16" w:line="247" w:lineRule="auto"/>
         <w:jc w:val="left"/>
       </w:pPr>
       <w:r>
@@ -242,7 +316,7 @@
           <w:rFonts w:ascii="Calibri" w:hAnsi="Calibri"/>
           <w:b w:val="0"/>
           <w:i/>
-          <w:color w:val="333333"/>
+          <w:color w:val="B8336A"/>
           <w:sz w:val="16"/>
         </w:rPr>
         <w:t>Agence d'intérim Caprisio, Lille  |  08/2026 – 10/2026 (2 vacations événementielles jour de match : août &amp; octobre 2026)</w:t>
@@ -250,16 +324,15 @@
     </w:p>
     <w:p>
       <w:pPr>
-        <w:spacing w:before="0" w:after="18" w:line="250" w:lineRule="auto"/>
+        <w:spacing w:before="0" w:after="16" w:line="247" w:lineRule="auto"/>
         <w:ind w:left="198" w:hanging="142"/>
         <w:jc w:val="left"/>
       </w:pPr>
       <w:r>
         <w:rPr>
           <w:rFonts w:ascii="Calibri" w:hAnsi="Calibri"/>
-          <w:b w:val="0"/>
-          <w:i w:val="0"/>
-          <w:color w:val="111111"/>
+          <w:b/>
+          <w:color w:val="B8336A"/>
           <w:sz w:val="17"/>
         </w:rPr>
         <w:t xml:space="preserve">• </w:t>
@@ -272,7 +345,7 @@
           <w:color w:val="111111"/>
           <w:sz w:val="17"/>
         </w:rPr>
-        <w:t>Accueil et gestion de flux à forte affluence :</w:t>
+        <w:t>Accueil et gestion de flux à forte affluence (+35 000 personnes) :</w:t>
       </w:r>
       <w:r>
         <w:rPr>
@@ -282,21 +355,20 @@
           <w:color w:val="111111"/>
           <w:sz w:val="17"/>
         </w:rPr>
-        <w:t xml:space="preserve"> réception, contrôle visuel et orientation de milliers de clients et spectateurs vers leurs tribunes, salons et accès dédiés lors de rencontres à plus de 35 000 personnes.</w:t>
+        <w:t xml:space="preserve"> réception, contrôle visuel et orientation de milliers de clients et spectateurs vers leurs tribunes, salons et accès dédiés.</w:t>
       </w:r>
     </w:p>
     <w:p>
       <w:pPr>
-        <w:spacing w:before="0" w:after="18" w:line="250" w:lineRule="auto"/>
+        <w:spacing w:before="0" w:after="16" w:line="247" w:lineRule="auto"/>
         <w:ind w:left="198" w:hanging="142"/>
         <w:jc w:val="left"/>
       </w:pPr>
       <w:r>
         <w:rPr>
           <w:rFonts w:ascii="Calibri" w:hAnsi="Calibri"/>
-          <w:b w:val="0"/>
-          <w:i w:val="0"/>
-          <w:color w:val="111111"/>
+          <w:b/>
+          <w:color w:val="B8336A"/>
           <w:sz w:val="17"/>
         </w:rPr>
         <w:t xml:space="preserve">• </w:t>
@@ -319,21 +391,20 @@
           <w:color w:val="111111"/>
           <w:sz w:val="17"/>
         </w:rPr>
-        <w:t xml:space="preserve"> renseignement proactif, réponse rapide aux demandes pratiques, fluidification des files d'attente et maintien d'un accueil souriant et courtois sous pression.</w:t>
+        <w:t xml:space="preserve"> renseignement proactif, résolution rapide des demandes pratiques, fluidification des files d'attente et maintien d'un accueil souriant sous forte cadence.</w:t>
       </w:r>
     </w:p>
     <w:p>
       <w:pPr>
-        <w:spacing w:before="0" w:after="18" w:line="250" w:lineRule="auto"/>
+        <w:spacing w:before="0" w:after="16" w:line="247" w:lineRule="auto"/>
         <w:ind w:left="198" w:hanging="142"/>
         <w:jc w:val="left"/>
       </w:pPr>
       <w:r>
         <w:rPr>
           <w:rFonts w:ascii="Calibri" w:hAnsi="Calibri"/>
-          <w:b w:val="0"/>
-          <w:i w:val="0"/>
-          <w:color w:val="111111"/>
+          <w:b/>
+          <w:color w:val="B8336A"/>
           <w:sz w:val="17"/>
         </w:rPr>
         <w:t xml:space="preserve">• </w:t>
@@ -346,7 +417,7 @@
           <w:color w:val="111111"/>
           <w:sz w:val="17"/>
         </w:rPr>
-        <w:t>Fiabilité opérationnelle :</w:t>
+        <w:t>Fiabilité reconnue :</w:t>
       </w:r>
       <w:r>
         <w:rPr>
@@ -356,12 +427,12 @@
           <w:color w:val="111111"/>
           <w:sz w:val="17"/>
         </w:rPr>
-        <w:t xml:space="preserve"> respect strict des consignes de sécurité, de présentation et de ponctualité ; mission renouvelée en octobre 2026 suite à la satisfaction de l'agence et du client en août 2026.</w:t>
+        <w:t xml:space="preserve"> respect strict des consignes de sécurité, de présentation et de ponctualité ; mission renouvelée en octobre 2026 suite à la satisfaction client d'août 2026.</w:t>
       </w:r>
     </w:p>
     <w:p>
       <w:pPr>
-        <w:spacing w:before="40" w:after="6" w:line="250" w:lineRule="auto"/>
+        <w:spacing w:before="36" w:after="4" w:line="247" w:lineRule="auto"/>
         <w:jc w:val="left"/>
       </w:pPr>
       <w:r>
@@ -372,12 +443,12 @@
           <w:color w:val="111111"/>
           <w:sz w:val="18"/>
         </w:rPr>
-        <w:t>Association Audiovisuelle &amp; Communication — Chargée d'Organisation, Accueil &amp; Production</w:t>
+        <w:t>Association Audiovisuelle &amp; Communication — Chargée de Production, Formation &amp; Accueil (2 ans)</w:t>
       </w:r>
     </w:p>
     <w:p>
       <w:pPr>
-        <w:spacing w:before="0" w:after="20" w:line="250" w:lineRule="auto"/>
+        <w:spacing w:before="0" w:after="16" w:line="247" w:lineRule="auto"/>
         <w:jc w:val="left"/>
       </w:pPr>
       <w:r>
@@ -385,7 +456,7 @@
           <w:rFonts w:ascii="Calibri" w:hAnsi="Calibri"/>
           <w:b w:val="0"/>
           <w:i/>
-          <w:color w:val="333333"/>
+          <w:color w:val="B8336A"/>
           <w:sz w:val="16"/>
         </w:rPr>
         <w:t>Lille  |  2023 – 2025</w:t>
@@ -393,16 +464,15 @@
     </w:p>
     <w:p>
       <w:pPr>
-        <w:spacing w:before="0" w:after="18" w:line="250" w:lineRule="auto"/>
+        <w:spacing w:before="0" w:after="16" w:line="247" w:lineRule="auto"/>
         <w:ind w:left="198" w:hanging="142"/>
         <w:jc w:val="left"/>
       </w:pPr>
       <w:r>
         <w:rPr>
           <w:rFonts w:ascii="Calibri" w:hAnsi="Calibri"/>
-          <w:b w:val="0"/>
-          <w:i w:val="0"/>
-          <w:color w:val="111111"/>
+          <w:b/>
+          <w:color w:val="B8336A"/>
           <w:sz w:val="17"/>
         </w:rPr>
         <w:t xml:space="preserve">• </w:t>
@@ -415,7 +485,7 @@
           <w:color w:val="111111"/>
           <w:sz w:val="17"/>
         </w:rPr>
-        <w:t>Organisation terrain et tenue des espaces :</w:t>
+        <w:t>Formation et accompagnement de personnes :</w:t>
       </w:r>
       <w:r>
         <w:rPr>
@@ -425,21 +495,20 @@
           <w:color w:val="111111"/>
           <w:sz w:val="17"/>
         </w:rPr>
-        <w:t xml:space="preserve"> préparation logistique des événements, installation, rangement et accueil physique des participants et intervenants.</w:t>
+        <w:t xml:space="preserve"> intégration, formation pratique et transmission des procédures opérationnelles et techniques (régie live ATEM, organisation terrain) aux nouveaux membres.</w:t>
       </w:r>
     </w:p>
     <w:p>
       <w:pPr>
-        <w:spacing w:before="0" w:after="18" w:line="250" w:lineRule="auto"/>
+        <w:spacing w:before="0" w:after="16" w:line="247" w:lineRule="auto"/>
         <w:ind w:left="198" w:hanging="142"/>
         <w:jc w:val="left"/>
       </w:pPr>
       <w:r>
         <w:rPr>
           <w:rFonts w:ascii="Calibri" w:hAnsi="Calibri"/>
-          <w:b w:val="0"/>
-          <w:i w:val="0"/>
-          <w:color w:val="111111"/>
+          <w:b/>
+          <w:color w:val="B8336A"/>
           <w:sz w:val="17"/>
         </w:rPr>
         <w:t xml:space="preserve">• </w:t>
@@ -452,7 +521,7 @@
           <w:color w:val="111111"/>
           <w:sz w:val="17"/>
         </w:rPr>
-        <w:t>Coordination d'équipe en temps réel :</w:t>
+        <w:t>Organisation événementielle et accueil public :</w:t>
       </w:r>
       <w:r>
         <w:rPr>
@@ -462,21 +531,20 @@
           <w:color w:val="111111"/>
           <w:sz w:val="17"/>
         </w:rPr>
-        <w:t xml:space="preserve"> synchronisation opérationnelle entre les pôles techniques et communication sous délais serrés (gestion de régie live ATEM, suivi rigoureux des plannings).</w:t>
+        <w:t xml:space="preserve"> préparation logistique des espaces, rangement, installation du matériel et accueil physique des participants et intervenants lors des événements.</w:t>
       </w:r>
     </w:p>
     <w:p>
       <w:pPr>
-        <w:spacing w:before="0" w:after="18" w:line="250" w:lineRule="auto"/>
+        <w:spacing w:before="0" w:after="16" w:line="247" w:lineRule="auto"/>
         <w:ind w:left="198" w:hanging="142"/>
         <w:jc w:val="left"/>
       </w:pPr>
       <w:r>
         <w:rPr>
           <w:rFonts w:ascii="Calibri" w:hAnsi="Calibri"/>
-          <w:b w:val="0"/>
-          <w:i w:val="0"/>
-          <w:color w:val="111111"/>
+          <w:b/>
+          <w:color w:val="B8336A"/>
           <w:sz w:val="17"/>
         </w:rPr>
         <w:t xml:space="preserve">• </w:t>
@@ -489,7 +557,7 @@
           <w:color w:val="111111"/>
           <w:sz w:val="17"/>
         </w:rPr>
-        <w:t>Polyvalence et réactivité :</w:t>
+        <w:t>Coordination d'équipe sous délais serrés :</w:t>
       </w:r>
       <w:r>
         <w:rPr>
@@ -499,12 +567,12 @@
           <w:color w:val="111111"/>
           <w:sz w:val="17"/>
         </w:rPr>
-        <w:t xml:space="preserve"> résolution rapide des imprévus en direct, vérification du matériel et travail collaboratif en équipe pluridisciplinaire.</w:t>
+        <w:t xml:space="preserve"> pilotage en temps réel entre les pôles techniques et communication, gestion du stress et résolution immédiate des imprévus.</w:t>
       </w:r>
     </w:p>
     <w:p>
       <w:pPr>
-        <w:spacing w:before="40" w:after="6" w:line="250" w:lineRule="auto"/>
+        <w:spacing w:before="36" w:after="4" w:line="247" w:lineRule="auto"/>
         <w:jc w:val="left"/>
       </w:pPr>
       <w:r>
@@ -515,12 +583,12 @@
           <w:color w:val="111111"/>
           <w:sz w:val="18"/>
         </w:rPr>
-        <w:t>ABC Consulting — Assistante Polyvalente &amp; Accueil Administratif (Bénévolat)</w:t>
+        <w:t>ABC Consulting — Assistante Polyvalente &amp; Relation Visiteurs / Clients (3 mois)</w:t>
       </w:r>
     </w:p>
     <w:p>
       <w:pPr>
-        <w:spacing w:before="0" w:after="20" w:line="250" w:lineRule="auto"/>
+        <w:spacing w:before="0" w:after="16" w:line="247" w:lineRule="auto"/>
         <w:jc w:val="left"/>
       </w:pPr>
       <w:r>
@@ -528,24 +596,23 @@
           <w:rFonts w:ascii="Calibri" w:hAnsi="Calibri"/>
           <w:b w:val="0"/>
           <w:i/>
-          <w:color w:val="333333"/>
+          <w:color w:val="B8336A"/>
           <w:sz w:val="16"/>
         </w:rPr>
-        <w:t>Libreville, Gabon  |  2022</w:t>
+        <w:t>Libreville  |  2022</w:t>
       </w:r>
     </w:p>
     <w:p>
       <w:pPr>
-        <w:spacing w:before="0" w:after="18" w:line="250" w:lineRule="auto"/>
+        <w:spacing w:before="0" w:after="16" w:line="247" w:lineRule="auto"/>
         <w:ind w:left="198" w:hanging="142"/>
         <w:jc w:val="left"/>
       </w:pPr>
       <w:r>
         <w:rPr>
           <w:rFonts w:ascii="Calibri" w:hAnsi="Calibri"/>
-          <w:b w:val="0"/>
-          <w:i w:val="0"/>
-          <w:color w:val="111111"/>
+          <w:b/>
+          <w:color w:val="B8336A"/>
           <w:sz w:val="17"/>
         </w:rPr>
         <w:t xml:space="preserve">• </w:t>
@@ -558,7 +625,7 @@
           <w:color w:val="111111"/>
           <w:sz w:val="17"/>
         </w:rPr>
-        <w:t>Accueil physique et relation visiteurs :</w:t>
+        <w:t>Accueil client et orientation (3 mois en cabinet) :</w:t>
       </w:r>
       <w:r>
         <w:rPr>
@@ -568,21 +635,20 @@
           <w:color w:val="111111"/>
           <w:sz w:val="17"/>
         </w:rPr>
-        <w:t xml:space="preserve"> réception, orientation des clients du cabinet et traitement des demandes courantes avec courtoisie et professionnalisme.</w:t>
+        <w:t xml:space="preserve"> réception quotidienne des clients et visiteurs, traitement courtois des demandes d'information et tenue soignée de l'espace d'accueil.</w:t>
       </w:r>
     </w:p>
     <w:p>
       <w:pPr>
-        <w:spacing w:before="0" w:after="18" w:line="250" w:lineRule="auto"/>
+        <w:spacing w:before="0" w:after="16" w:line="247" w:lineRule="auto"/>
         <w:ind w:left="198" w:hanging="142"/>
         <w:jc w:val="left"/>
       </w:pPr>
       <w:r>
         <w:rPr>
           <w:rFonts w:ascii="Calibri" w:hAnsi="Calibri"/>
-          <w:b w:val="0"/>
-          <w:i w:val="0"/>
-          <w:color w:val="111111"/>
+          <w:b/>
+          <w:color w:val="B8336A"/>
           <w:sz w:val="17"/>
         </w:rPr>
         <w:t xml:space="preserve">• </w:t>
@@ -605,29 +671,29 @@
           <w:color w:val="111111"/>
           <w:sz w:val="17"/>
         </w:rPr>
-        <w:t xml:space="preserve"> classement, gestion documentaire, saisie bureautique (Pack Office) et soutien polyvalent à l'équipe selon les pics d'activité.</w:t>
+        <w:t xml:space="preserve"> classement, vérification documentaire, saisie bureautique (Pack Office) et soutien polyvalent à l'équipe selon les pics d'activité.</w:t>
       </w:r>
     </w:p>
     <w:p>
       <w:pPr>
-        <w:spacing w:before="90" w:after="40"/>
+        <w:spacing w:before="80" w:after="36"/>
         <w:pBdr>
-          <w:bottom w:val="single" w:sz="6" w:space="2" w:color="17375E"/>
+          <w:bottom w:val="single" w:sz="6" w:space="2" w:color="B8336A"/>
         </w:pBdr>
       </w:pPr>
       <w:r>
         <w:rPr>
           <w:rFonts w:ascii="Calibri" w:hAnsi="Calibri"/>
           <w:b/>
-          <w:color w:val="17375E"/>
-          <w:sz w:val="20"/>
+          <w:color w:val="B8336A"/>
+          <w:sz w:val="19"/>
         </w:rPr>
         <w:t>FORMATION</w:t>
       </w:r>
     </w:p>
     <w:p>
       <w:pPr>
-        <w:spacing w:before="36" w:after="6" w:line="250" w:lineRule="auto"/>
+        <w:spacing w:before="30" w:after="4" w:line="247" w:lineRule="auto"/>
         <w:jc w:val="left"/>
       </w:pPr>
       <w:r>
@@ -636,14 +702,14 @@
           <w:b/>
           <w:i w:val="0"/>
           <w:color w:val="111111"/>
-          <w:sz w:val="18"/>
+          <w:sz w:val="17"/>
         </w:rPr>
         <w:t>Université de Lille — Licence Économie et Gestion (Parcours Économie et Management des Entreprises)</w:t>
       </w:r>
     </w:p>
     <w:p>
       <w:pPr>
-        <w:spacing w:before="0" w:after="16" w:line="250" w:lineRule="auto"/>
+        <w:spacing w:before="0" w:after="14" w:line="247" w:lineRule="auto"/>
         <w:jc w:val="left"/>
       </w:pPr>
       <w:r>
@@ -651,7 +717,7 @@
           <w:rFonts w:ascii="Calibri" w:hAnsi="Calibri"/>
           <w:b w:val="0"/>
           <w:i/>
-          <w:color w:val="333333"/>
+          <w:color w:val="B8336A"/>
           <w:sz w:val="16"/>
         </w:rPr>
         <w:t>Lille  |  2024 – Présent (Statut étudiant actif 2026–2027)</w:t>
@@ -659,10 +725,19 @@
     </w:p>
     <w:p>
       <w:pPr>
-        <w:spacing w:before="0" w:after="18" w:line="250" w:lineRule="auto"/>
+        <w:spacing w:before="0" w:after="16" w:line="247" w:lineRule="auto"/>
         <w:ind w:left="198" w:hanging="142"/>
         <w:jc w:val="left"/>
       </w:pPr>
+      <w:r>
+        <w:rPr>
+          <w:rFonts w:ascii="Calibri" w:hAnsi="Calibri"/>
+          <w:b/>
+          <w:color w:val="B8336A"/>
+          <w:sz w:val="17"/>
+        </w:rPr>
+        <w:t xml:space="preserve">• </w:t>
+      </w:r>
       <w:r>
         <w:rPr>
           <w:rFonts w:ascii="Calibri" w:hAnsi="Calibri"/>
@@ -671,12 +746,12 @@
           <w:color w:val="111111"/>
           <w:sz w:val="17"/>
         </w:rPr>
-        <w:t>• Compétences clés : gestion d'entreprise, suivi de stocks, analyse chiffrée, rigueur organisationnelle et outils bureautiques.</w:t>
+        <w:t>Compétences clés : gestion d'entreprise, suivi de stocks, analyse chiffrée, rigueur organisationnelle et outils bureautiques.</w:t>
       </w:r>
     </w:p>
     <w:p>
       <w:pPr>
-        <w:spacing w:before="36" w:after="6" w:line="250" w:lineRule="auto"/>
+        <w:spacing w:before="30" w:after="4" w:line="247" w:lineRule="auto"/>
         <w:jc w:val="left"/>
       </w:pPr>
       <w:r>
@@ -685,14 +760,14 @@
           <w:b/>
           <w:i w:val="0"/>
           <w:color w:val="111111"/>
-          <w:sz w:val="18"/>
+          <w:sz w:val="17"/>
         </w:rPr>
         <w:t>Lycée Gaston Berger — Classe Préparatoire ECG (Économique et Commerciale voie Générale)</w:t>
       </w:r>
     </w:p>
     <w:p>
       <w:pPr>
-        <w:spacing w:before="0" w:after="16" w:line="250" w:lineRule="auto"/>
+        <w:spacing w:before="0" w:after="14" w:line="247" w:lineRule="auto"/>
         <w:jc w:val="left"/>
       </w:pPr>
       <w:r>
@@ -700,7 +775,7 @@
           <w:rFonts w:ascii="Calibri" w:hAnsi="Calibri"/>
           <w:b w:val="0"/>
           <w:i/>
-          <w:color w:val="333333"/>
+          <w:color w:val="B8336A"/>
           <w:sz w:val="16"/>
         </w:rPr>
         <w:t>Lille  |  2023 – 2024</w:t>
@@ -708,10 +783,19 @@
     </w:p>
     <w:p>
       <w:pPr>
-        <w:spacing w:before="0" w:after="18" w:line="250" w:lineRule="auto"/>
+        <w:spacing w:before="0" w:after="16" w:line="247" w:lineRule="auto"/>
         <w:ind w:left="198" w:hanging="142"/>
         <w:jc w:val="left"/>
       </w:pPr>
+      <w:r>
+        <w:rPr>
+          <w:rFonts w:ascii="Calibri" w:hAnsi="Calibri"/>
+          <w:b/>
+          <w:color w:val="B8336A"/>
+          <w:sz w:val="17"/>
+        </w:rPr>
+        <w:t xml:space="preserve">• </w:t>
+      </w:r>
       <w:r>
         <w:rPr>
           <w:rFonts w:ascii="Calibri" w:hAnsi="Calibri"/>
@@ -720,12 +804,12 @@
           <w:color w:val="111111"/>
           <w:sz w:val="17"/>
         </w:rPr>
-        <w:t>• Formation intensive : rapidité d'exécution, aisance en calcul mental, capacité de travail élevée, discipline et ponctualité.</w:t>
+        <w:t>Formation intensive : rapidité d'exécution, aisance en calcul mental, capacité de travail élevée, discipline et ponctualité.</w:t>
       </w:r>
     </w:p>
     <w:p>
       <w:pPr>
-        <w:spacing w:before="36" w:after="6" w:line="250" w:lineRule="auto"/>
+        <w:spacing w:before="30" w:after="4" w:line="247" w:lineRule="auto"/>
         <w:jc w:val="left"/>
       </w:pPr>
       <w:r>
@@ -734,14 +818,14 @@
           <w:b/>
           <w:i w:val="0"/>
           <w:color w:val="111111"/>
-          <w:sz w:val="18"/>
+          <w:sz w:val="17"/>
         </w:rPr>
         <w:t>Lycée Nelson Mandela — Baccalauréat Général Série ES (Économique et Social)</w:t>
       </w:r>
     </w:p>
     <w:p>
       <w:pPr>
-        <w:spacing w:before="0" w:after="16" w:line="250" w:lineRule="auto"/>
+        <w:spacing w:before="0" w:after="14" w:line="247" w:lineRule="auto"/>
         <w:jc w:val="left"/>
       </w:pPr>
       <w:r>
@@ -749,7 +833,7 @@
           <w:rFonts w:ascii="Calibri" w:hAnsi="Calibri"/>
           <w:b w:val="0"/>
           <w:i/>
-          <w:color w:val="333333"/>
+          <w:color w:val="B8336A"/>
           <w:sz w:val="16"/>
         </w:rPr>
         <w:t>Libreville  |  2022 – 2023 (Obtenu en 2023)</w:t>
@@ -757,33 +841,32 @@
     </w:p>
     <w:p>
       <w:pPr>
-        <w:spacing w:before="90" w:after="40"/>
+        <w:spacing w:before="80" w:after="36"/>
         <w:pBdr>
-          <w:bottom w:val="single" w:sz="6" w:space="2" w:color="17375E"/>
+          <w:bottom w:val="single" w:sz="6" w:space="2" w:color="B8336A"/>
         </w:pBdr>
       </w:pPr>
       <w:r>
         <w:rPr>
           <w:rFonts w:ascii="Calibri" w:hAnsi="Calibri"/>
           <w:b/>
-          <w:color w:val="17375E"/>
-          <w:sz w:val="20"/>
+          <w:color w:val="B8336A"/>
+          <w:sz w:val="19"/>
         </w:rPr>
         <w:t>COMPÉTENCES CLÉS &amp; DISPONIBILITÉS</w:t>
       </w:r>
     </w:p>
     <w:p>
       <w:pPr>
-        <w:spacing w:before="0" w:after="20" w:line="250" w:lineRule="auto"/>
+        <w:spacing w:before="0" w:after="18" w:line="247" w:lineRule="auto"/>
         <w:ind w:left="198" w:hanging="142"/>
         <w:jc w:val="left"/>
       </w:pPr>
       <w:r>
         <w:rPr>
           <w:rFonts w:ascii="Calibri" w:hAnsi="Calibri"/>
-          <w:b w:val="0"/>
-          <w:i w:val="0"/>
-          <w:color w:val="111111"/>
+          <w:b/>
+          <w:color w:val="B8336A"/>
           <w:sz w:val="17"/>
         </w:rPr>
         <w:t xml:space="preserve">• </w:t>
@@ -806,21 +889,20 @@
           <w:color w:val="111111"/>
           <w:sz w:val="17"/>
         </w:rPr>
-        <w:t>accueil et conseil client, mise en rayon, réassort, pliage, cintrage, rangement, facing, étiquetage, tenue de la surface de vente et des cabines d'essayage, réception et contrôle de livraisons, gestion de réserve/stocks, respect des normes d'hygiène et de sécurité.</w:t>
+        <w:t>accueil et conseil client, mise en rayon, réassort, pliage, cintrage, rangement, facing, étiquetage, tenue de la surface de vente et des cabines d'essayage, réception de livraisons, gestion de réserve/stocks, normes d'hygiène et sécurité.</w:t>
       </w:r>
     </w:p>
     <w:p>
       <w:pPr>
-        <w:spacing w:before="0" w:after="20" w:line="250" w:lineRule="auto"/>
+        <w:spacing w:before="0" w:after="18" w:line="247" w:lineRule="auto"/>
         <w:ind w:left="198" w:hanging="142"/>
         <w:jc w:val="left"/>
       </w:pPr>
       <w:r>
         <w:rPr>
           <w:rFonts w:ascii="Calibri" w:hAnsi="Calibri"/>
-          <w:b w:val="0"/>
-          <w:i w:val="0"/>
-          <w:color w:val="111111"/>
+          <w:b/>
+          <w:color w:val="B8336A"/>
           <w:sz w:val="17"/>
         </w:rPr>
         <w:t xml:space="preserve">• </w:t>
@@ -833,7 +915,7 @@
           <w:color w:val="111111"/>
           <w:sz w:val="17"/>
         </w:rPr>
-        <w:t xml:space="preserve">Caisse, Relation Client &amp; Chiffres : </w:t>
+        <w:t xml:space="preserve">Caisse, Relation Client &amp; Formation : </w:t>
       </w:r>
       <w:r>
         <w:rPr>
@@ -843,21 +925,20 @@
           <w:color w:val="111111"/>
           <w:sz w:val="17"/>
         </w:rPr>
-        <w:t>forte aisance chiffrée et calcul mental (Prépa ECG / Licence Éco-Gestion), assimilation rapide des procédures d'encaissement (caisse classique &amp; accompagnement caisses automatiques libre-service), retours/échanges, promotion carte de fidélité.</w:t>
+        <w:t>aisance chiffrée et calcul mental (Prépa ECG / Éco-Gestion), assimilation rapide des logiciels d'encaissement (caisse classique &amp; caisses automatiques libre-service), retours/échanges, fidélité, capacité à former et épauler ses collègues.</w:t>
       </w:r>
     </w:p>
     <w:p>
       <w:pPr>
-        <w:spacing w:before="0" w:after="20" w:line="250" w:lineRule="auto"/>
+        <w:spacing w:before="0" w:after="18" w:line="247" w:lineRule="auto"/>
         <w:ind w:left="198" w:hanging="142"/>
         <w:jc w:val="left"/>
       </w:pPr>
       <w:r>
         <w:rPr>
           <w:rFonts w:ascii="Calibri" w:hAnsi="Calibri"/>
-          <w:b w:val="0"/>
-          <w:i w:val="0"/>
-          <w:color w:val="111111"/>
+          <w:b/>
+          <w:color w:val="B8336A"/>
           <w:sz w:val="17"/>
         </w:rPr>
         <w:t xml:space="preserve">• </w:t>
@@ -880,21 +961,20 @@
           <w:color w:val="111111"/>
           <w:sz w:val="17"/>
         </w:rPr>
-        <w:t>ponctualité irréprochable, sourire, écoute active, dynamisme, résistance au stress et à la station debout, travail d'équipe, maîtrise du Pack Office (Excel, Word, PowerPoint).</w:t>
+        <w:t>ponctualité irréprochable, sourire, écoute active, dynamisme, endurance en station debout, esprit d'équipe, Pack Office (Excel, Word, PowerPoint).</w:t>
       </w:r>
     </w:p>
     <w:p>
       <w:pPr>
-        <w:spacing w:before="0" w:after="20" w:line="250" w:lineRule="auto"/>
+        <w:spacing w:before="0" w:after="18" w:line="247" w:lineRule="auto"/>
         <w:ind w:left="198" w:hanging="142"/>
         <w:jc w:val="left"/>
       </w:pPr>
       <w:r>
         <w:rPr>
           <w:rFonts w:ascii="Calibri" w:hAnsi="Calibri"/>
-          <w:b w:val="0"/>
-          <w:i w:val="0"/>
-          <w:color w:val="111111"/>
+          <w:b/>
+          <w:color w:val="B8336A"/>
           <w:sz w:val="17"/>
         </w:rPr>
         <w:t xml:space="preserve">• </w:t>
@@ -917,38 +997,37 @@
           <w:color w:val="111111"/>
           <w:sz w:val="17"/>
         </w:rPr>
-        <w:t>disponibilité immédiate en CDI étudiant / temps partiel (prise de poste matinale dès 6h00, après-midi, soirées, samedi, dimanche et temps plein vacances scolaires). Domicile à 7 min à pied de Lille Flandres, Lille Europe et Westfield Euralille.</w:t>
+        <w:t>disponibilité immédiate en CDI étudiant / temps partiel (dès 6h00 le matin, après-midi, soirées, samedi, dimanche et temps plein vacances scolaires). Domicile au 51 rue de Tournai (2 min à pied de Lille Flandres &amp; Westfield Euralille).</w:t>
       </w:r>
     </w:p>
     <w:p>
       <w:pPr>
-        <w:spacing w:before="90" w:after="40"/>
+        <w:spacing w:before="80" w:after="36"/>
         <w:pBdr>
-          <w:bottom w:val="single" w:sz="6" w:space="2" w:color="17375E"/>
+          <w:bottom w:val="single" w:sz="6" w:space="2" w:color="B8336A"/>
         </w:pBdr>
       </w:pPr>
       <w:r>
         <w:rPr>
           <w:rFonts w:ascii="Calibri" w:hAnsi="Calibri"/>
           <w:b/>
-          <w:color w:val="17375E"/>
-          <w:sz w:val="20"/>
+          <w:color w:val="B8336A"/>
+          <w:sz w:val="19"/>
         </w:rPr>
         <w:t>LANGUES &amp; CENTRES D'INTÉRÊT</w:t>
       </w:r>
     </w:p>
     <w:p>
       <w:pPr>
-        <w:spacing w:before="0" w:after="18" w:line="250" w:lineRule="auto"/>
+        <w:spacing w:before="0" w:after="16" w:line="247" w:lineRule="auto"/>
         <w:ind w:left="198" w:hanging="142"/>
         <w:jc w:val="left"/>
       </w:pPr>
       <w:r>
         <w:rPr>
           <w:rFonts w:ascii="Calibri" w:hAnsi="Calibri"/>
-          <w:b w:val="0"/>
-          <w:i w:val="0"/>
-          <w:color w:val="111111"/>
+          <w:b/>
+          <w:color w:val="B8336A"/>
           <w:sz w:val="17"/>
         </w:rPr>
         <w:t xml:space="preserve">• </w:t>
@@ -991,7 +1070,7 @@
           <w:color w:val="111111"/>
           <w:sz w:val="17"/>
         </w:rPr>
-        <w:t xml:space="preserve"> niveau B1 (accueil et renseignement d'une clientèle internationale en gare / magasin)  |  </w:t>
+        <w:t xml:space="preserve"> niveau B1 (accueil et orientation d'une clientèle internationale en gare / magasin)  |  </w:t>
       </w:r>
       <w:r>
         <w:rPr>
@@ -1036,16 +1115,15 @@
     </w:p>
     <w:p>
       <w:pPr>
-        <w:spacing w:before="0" w:after="0" w:line="250" w:lineRule="auto"/>
+        <w:spacing w:before="0" w:after="0" w:line="247" w:lineRule="auto"/>
         <w:ind w:left="198" w:hanging="142"/>
         <w:jc w:val="left"/>
       </w:pPr>
       <w:r>
         <w:rPr>
           <w:rFonts w:ascii="Calibri" w:hAnsi="Calibri"/>
-          <w:b w:val="0"/>
-          <w:i w:val="0"/>
-          <w:color w:val="111111"/>
+          <w:b/>
+          <w:color w:val="B8336A"/>
           <w:sz w:val="17"/>
         </w:rPr>
         <w:t xml:space="preserve">• </w:t>
@@ -1068,12 +1146,12 @@
           <w:color w:val="111111"/>
           <w:sz w:val="17"/>
         </w:rPr>
-        <w:t xml:space="preserve"> Natation (pratique régulière, endurance), Chant, Réalisation audiovisuelle, Lecture &amp; Culture.</w:t>
+        <w:t xml:space="preserve"> Natation (pratique régulière, endurance), Chant, Réalisation audiovisuelle, Lecture &amp; Vie associative.</w:t>
       </w:r>
     </w:p>
     <w:sectPr>
       <w:pgSz w:w="11906" w:h="16838"/>
-      <w:pgMar w:top="539" w:right="709" w:bottom="510" w:left="709" w:header="720" w:footer="720" w:gutter="0"/>
+      <w:pgMar w:top="482" w:right="680" w:bottom="454" w:left="680" w:header="720" w:footer="720" w:gutter="0"/>
       <w:cols w:space="720"/>
       <w:docGrid w:linePitch="360"/>
     </w:sectPr>

</xml_diff>